<commit_message>
FD04: agregar carátula institucional y control de versiones
</commit_message>
<xml_diff>
--- a/docs/FD04-EPIS-Informe Arquitectura de Software.docx
+++ b/docs/FD04-EPIS-Informe Arquitectura de Software.docx
@@ -2,12 +2,145 @@
 <file path=word/document.xml><?xml version="1.0" encoding="utf-8"?>
 <w:document xmlns:wpc="http://schemas.microsoft.com/office/word/2010/wordprocessingCanvas" xmlns:mo="http://schemas.microsoft.com/office/mac/office/2008/main" xmlns:mc="http://schemas.openxmlformats.org/markup-compatibility/2006" xmlns:mv="urn:schemas-microsoft-com:mac:vml" xmlns:o="urn:schemas-microsoft-com:office:office" xmlns:r="http://schemas.openxmlformats.org/officeDocument/2006/relationships" xmlns:m="http://schemas.openxmlformats.org/officeDocument/2006/math" xmlns:v="urn:schemas-microsoft-com:vml" xmlns:wp14="http://schemas.microsoft.com/office/word/2010/wordprocessingDrawing" xmlns:wp="http://schemas.openxmlformats.org/drawingml/2006/wordprocessingDrawing" xmlns:w10="urn:schemas-microsoft-com:office:word" xmlns:w="http://schemas.openxmlformats.org/wordprocessingml/2006/main" xmlns:w14="http://schemas.microsoft.com/office/word/2010/wordml" xmlns:wpg="http://schemas.microsoft.com/office/word/2010/wordprocessingGroup" xmlns:wpi="http://schemas.microsoft.com/office/word/2010/wordprocessingInk" xmlns:wne="http://schemas.microsoft.com/office/word/2006/wordml" xmlns:wps="http://schemas.microsoft.com/office/word/2010/wordprocessingShape" mc:Ignorable="w14 wp14">
   <w:body>
+    <w:p/>
     <w:p>
       <w:pPr>
         <w:pStyle w:val="Heading1"/>
       </w:pPr>
       <w:r>
-        <w:t>FD04-EPIS - Informe Arquitectura de Software</w:t>
+        <w:t>UNIVERSIDAD PRIVADA DE TACNA</w:t>
+      </w:r>
+    </w:p>
+    <w:p>
+      <w:pPr>
+        <w:pStyle w:val="Heading2"/>
+      </w:pPr>
+      <w:r>
+        <w:t>FACULTAD DE INGENIERÍA</w:t>
+      </w:r>
+    </w:p>
+    <w:p>
+      <w:pPr>
+        <w:pStyle w:val="Heading3"/>
+      </w:pPr>
+      <w:r>
+        <w:t>Escuela Profesional de Ingeniería de Sistemas</w:t>
+      </w:r>
+    </w:p>
+    <w:p/>
+    <w:p>
+      <w:r>
+        <w:t>**Proyecto:** "Agente de IA para Revisión y Asesoría de Tesis"</w:t>
+      </w:r>
+    </w:p>
+    <w:p/>
+    <w:p>
+      <w:r>
+        <w:t>**Curso:** Patrones de Software</w:t>
+      </w:r>
+    </w:p>
+    <w:p>
+      <w:r>
+        <w:t>**Docente:** Ing. Patrick Cuadros Quiroga</w:t>
+      </w:r>
+    </w:p>
+    <w:p/>
+    <w:p>
+      <w:r>
+        <w:t>**Integrantes:**</w:t>
+      </w:r>
+    </w:p>
+    <w:p>
+      <w:pPr>
+        <w:pStyle w:val="ListBullet"/>
+      </w:pPr>
+      <w:r>
+        <w:t>**Ayala Ramos, Carlos Daniel (2022074266)**</w:t>
+      </w:r>
+    </w:p>
+    <w:p>
+      <w:pPr>
+        <w:pStyle w:val="ListBullet"/>
+      </w:pPr>
+      <w:r>
+        <w:t>**Loyola Vilca, Renzo Fernando (2021072615)**</w:t>
+      </w:r>
+    </w:p>
+    <w:p>
+      <w:pPr>
+        <w:pStyle w:val="ListBullet"/>
+      </w:pPr>
+      <w:r>
+        <w:t>**Vargas Candia, Hashira Belén (2022075480)**</w:t>
+      </w:r>
+    </w:p>
+    <w:p/>
+    <w:p>
+      <w:r>
+        <w:t>**Tacna – Perú**</w:t>
+      </w:r>
+    </w:p>
+    <w:p>
+      <w:r>
+        <w:t>**2026**</w:t>
+      </w:r>
+    </w:p>
+    <w:p/>
+    <w:p>
+      <w:r>
+        <w:t>---</w:t>
+      </w:r>
+    </w:p>
+    <w:p/>
+    <w:p>
+      <w:pPr>
+        <w:pStyle w:val="Heading1"/>
+      </w:pPr>
+      <w:r>
+        <w:t>Sistema Agente de IA para Revisión y Asesoría de Tesis</w:t>
+      </w:r>
+    </w:p>
+    <w:p>
+      <w:pPr>
+        <w:pStyle w:val="Heading2"/>
+      </w:pPr>
+      <w:r>
+        <w:t>Informe de Arquitectura de Software</w:t>
+      </w:r>
+    </w:p>
+    <w:p>
+      <w:r>
+        <w:t>**Versión 1.0**</w:t>
+      </w:r>
+    </w:p>
+    <w:p/>
+    <w:p>
+      <w:pPr>
+        <w:pStyle w:val="Heading3"/>
+      </w:pPr>
+      <w:r>
+        <w:t>Control de versiones</w:t>
+      </w:r>
+    </w:p>
+    <w:p>
+      <w:r>
+        <w:t>| Versión | Hecha por | Revisada por | Aprobada por | Fecha | Motivo |</w:t>
+      </w:r>
+    </w:p>
+    <w:p>
+      <w:r>
+        <w:t>| --- | --- | --- | --- | --- | --- |</w:t>
+      </w:r>
+    </w:p>
+    <w:p>
+      <w:r>
+        <w:t>| 1.0 | - | - | - | 26/04/2026 | Versión inicial FD04 |</w:t>
+      </w:r>
+    </w:p>
+    <w:p/>
+    <w:p>
+      <w:r>
+        <w:t>---</w:t>
       </w:r>
     </w:p>
     <w:p/>

</xml_diff>